<commit_message>
Fix(preprocessor): usar pymupdf para PDFs + expandir 18 docs demo a 550-950 palabras
pdfminer/pdfplumber extraían texto con palabras pegadas de PDFs generados
por xelatex (ej. "desdeel15deenerode2023"). pymupdf reconstruye espacios
correctamente. Fallback a MarkItDown si pymupdf no está disponible.

También corregido clean_text() que colapsaba newlines con \s+ destruyendo
la estructura de párrafos.

Docs sintéticos expandidos de ~150-200 a 550-950 palabras para generar
2-4 chunks por documento en vez de 1. PDFs y DOCX regenerados.

31/31 tests verdes.

Co-Authored-By: Claude Haiku 4.5 <noreply@anthropic.com>
</commit_message>
<xml_diff>
--- a/data-synthetic/demo-tfm/L1_contrato-tipo-medico-residente.docx
+++ b/data-synthetic/demo-tfm/L1_contrato-tipo-medico-residente.docx
@@ -7,7 +7,7 @@
         <w:pStyle w:val="Title"/>
       </w:pPr>
       <w:r>
-        <w:t xml:space="preserve">Contrato tipo de médico residente</w:t>
+        <w:t xml:space="preserve">Contrato tipo — Médico interno residente</w:t>
       </w:r>
     </w:p>
     <w:p>
@@ -15,46 +15,43 @@
         <w:pStyle w:val="Author"/>
       </w:pPr>
       <w:r>
-        <w:t xml:space="preserve">Sr. Joaquín Vela Bermúdez</w:t>
-      </w:r>
-    </w:p>
-    <w:bookmarkStart w:id="16" w:name="contrato-tipo-de-médico-residente"/>
+        <w:t xml:space="preserve">Dña. Marta Solís Echevarría</w:t>
+      </w:r>
+    </w:p>
+    <w:bookmarkStart w:id="17" w:name="X035e2b617d7757e662865a1ca5674dc48d2df90"/>
     <w:p>
       <w:pPr>
         <w:pStyle w:val="Heading1"/>
       </w:pPr>
       <w:r>
-        <w:t xml:space="preserve">Contrato tipo de médico residente</w:t>
-      </w:r>
-    </w:p>
-    <w:bookmarkStart w:id="9" w:name="partes"/>
+        <w:t xml:space="preserve">Contrato de trabajo temporal — Médico interno residente (MIR)</w:t>
+      </w:r>
+    </w:p>
+    <w:bookmarkStart w:id="9" w:name="datos-de-las-partes"/>
     <w:p>
       <w:pPr>
         <w:pStyle w:val="Heading2"/>
       </w:pPr>
       <w:r>
-        <w:t xml:space="preserve">Partes</w:t>
+        <w:t xml:space="preserve">Datos de las partes</w:t>
       </w:r>
     </w:p>
     <w:p>
       <w:pPr>
         <w:pStyle w:val="FirstParagraph"/>
       </w:pPr>
-      <w:r>
-        <w:t xml:space="preserve">De una parte,</w:t>
-      </w:r>
-      <w:r>
-        <w:t xml:space="preserve"> </w:t>
-      </w:r>
       <w:r>
         <w:rPr>
           <w:b/>
           <w:bCs/>
         </w:rPr>
-        <w:t xml:space="preserve">Clínica Delos S.L.</w:t>
-      </w:r>
-      <w:r>
-        <w:t xml:space="preserve">, con CIF B-87654321 y domicilio social en Madrid, representada en este acto por su Gerente, el</w:t>
+        <w:t xml:space="preserve">Empresa:</w:t>
+      </w:r>
+      <w:r>
+        <w:t xml:space="preserve"> </w:t>
+      </w:r>
+      <w:r>
+        <w:t xml:space="preserve">Clínica Delos S.L., CIF B-12345678, con domicilio social en Avda. de la Constitución 42, 28001 Madrid.</w:t>
       </w:r>
       <w:r>
         <w:t xml:space="preserve"> </w:t>
@@ -64,187 +61,655 @@
           <w:b/>
           <w:bCs/>
         </w:rPr>
-        <w:t xml:space="preserve">Sr. Joaquín Vela Bermúdez</w:t>
-      </w:r>
-      <w:r>
-        <w:t xml:space="preserve">.</w:t>
-      </w:r>
-    </w:p>
-    <w:p>
-      <w:pPr>
-        <w:pStyle w:val="BodyText"/>
-      </w:pPr>
-      <w:r>
-        <w:t xml:space="preserve">De otra parte, el médico residente que suscribe el presente contrato, en adelante</w:t>
+        <w:t xml:space="preserve">Representante legal:</w:t>
       </w:r>
       <w:r>
         <w:t xml:space="preserve"> </w:t>
       </w:r>
       <w:r>
-        <w:t xml:space="preserve">“el Residente”</w:t>
-      </w:r>
-      <w:r>
-        <w:t xml:space="preserve">.</w:t>
-      </w:r>
-    </w:p>
-    <w:bookmarkEnd w:id="9"/>
-    <w:bookmarkStart w:id="10" w:name="objeto"/>
-    <w:p>
-      <w:pPr>
-        <w:pStyle w:val="Heading2"/>
-      </w:pPr>
-      <w:r>
-        <w:t xml:space="preserve">Objeto</w:t>
-      </w:r>
-    </w:p>
-    <w:p>
-      <w:pPr>
-        <w:pStyle w:val="FirstParagraph"/>
-      </w:pPr>
-      <w:r>
-        <w:t xml:space="preserve">El presente contrato regula la relación laboral del Residente durante el periodo de formación sanitaria especializada en Clínica Delos, conforme al Real Decreto 1146/2006 y normativa concordante.</w:t>
-      </w:r>
-    </w:p>
-    <w:bookmarkEnd w:id="10"/>
-    <w:bookmarkStart w:id="11" w:name="duración"/>
-    <w:p>
-      <w:pPr>
-        <w:pStyle w:val="Heading2"/>
-      </w:pPr>
-      <w:r>
-        <w:t xml:space="preserve">Duración</w:t>
-      </w:r>
-    </w:p>
-    <w:p>
-      <w:pPr>
-        <w:pStyle w:val="FirstParagraph"/>
-      </w:pPr>
-      <w:r>
-        <w:t xml:space="preserve">El contrato tiene una duración inicial coincidente con el primer año de residencia y se prorrogará automáticamente cada doce meses hasta la finalización del programa formativo, salvo causa justificada de extinción.</w:t>
-      </w:r>
-    </w:p>
-    <w:bookmarkEnd w:id="11"/>
-    <w:bookmarkStart w:id="12" w:name="retribución"/>
-    <w:p>
-      <w:pPr>
-        <w:pStyle w:val="Heading2"/>
-      </w:pPr>
-      <w:r>
-        <w:t xml:space="preserve">Retribución</w:t>
-      </w:r>
-    </w:p>
-    <w:p>
-      <w:pPr>
-        <w:pStyle w:val="FirstParagraph"/>
-      </w:pPr>
-      <w:r>
-        <w:t xml:space="preserve">La retribución se ajusta a las cuantías mínimas previstas en el Real Decreto 1146/2006 y se actualiza anualmente. Las guardias se retribuyen por separado según el cuadrante mensual aprobado por la dirección médica.</w:t>
-      </w:r>
-    </w:p>
-    <w:bookmarkEnd w:id="12"/>
-    <w:bookmarkStart w:id="13" w:name="jornada"/>
-    <w:p>
-      <w:pPr>
-        <w:pStyle w:val="Heading2"/>
-      </w:pPr>
-      <w:r>
-        <w:t xml:space="preserve">Jornada</w:t>
-      </w:r>
-    </w:p>
-    <w:p>
-      <w:pPr>
-        <w:pStyle w:val="FirstParagraph"/>
-      </w:pPr>
-      <w:r>
-        <w:t xml:space="preserve">La jornada ordinaria y las guardias se ajustan a la normativa específica de residentes. El cómputo no podrá exceder de los límites máximos establecidos por la Directiva 2003/88/CE relativa a tiempo de trabajo.</w:t>
-      </w:r>
-    </w:p>
-    <w:bookmarkEnd w:id="13"/>
-    <w:bookmarkStart w:id="14" w:name="confidencialidad"/>
-    <w:p>
-      <w:pPr>
-        <w:pStyle w:val="Heading2"/>
-      </w:pPr>
-      <w:r>
-        <w:t xml:space="preserve">Confidencialidad</w:t>
-      </w:r>
-    </w:p>
-    <w:p>
-      <w:pPr>
-        <w:pStyle w:val="FirstParagraph"/>
-      </w:pPr>
-      <w:r>
-        <w:t xml:space="preserve">El Residente se obliga a guardar secreto profesional sobre cualquier información clínica, técnica o de gestión a la que acceda durante la prestación de servicios, incluso una vez extinguido el contrato.</w:t>
-      </w:r>
-    </w:p>
-    <w:p>
-      <w:r>
-        <w:pict>
-          <v:rect style="width:0;height:1.5pt" o:hralign="center" o:hrstd="t" o:hr="t"/>
-        </w:pict>
-      </w:r>
-    </w:p>
-    <w:bookmarkEnd w:id="14"/>
-    <w:bookmarkStart w:id="15" w:name="X7fd67c11207f29c6cbc5f6a4fe6a0b696c8750d"/>
-    <w:p>
-      <w:pPr>
-        <w:pStyle w:val="Heading2"/>
-      </w:pPr>
-      <w:r>
-        <w:t xml:space="preserve">Annex I — English summary (informational only)</w:t>
-      </w:r>
-    </w:p>
-    <w:p>
-      <w:pPr>
-        <w:pStyle w:val="FirstParagraph"/>
-      </w:pPr>
-      <w:r>
-        <w:t xml:space="preserve">The present contract governs the labour relationship of the resident physician during the period of specialised health training at Clínica Delos. Initial duration matches the first residency year and renews automatically every twelve months until completion of the training programme. Remuneration follows Royal Decree 1146/2006 minimums and is updated annually. On-call duty is paid separately. The resident undertakes to keep professional secrecy on any clinical, technical or management information accessed during the contract, including after termination.</w:t>
-      </w:r>
-    </w:p>
-    <w:p>
-      <w:pPr>
-        <w:pStyle w:val="BodyText"/>
-      </w:pPr>
-      <w:r>
-        <w:t xml:space="preserve">This annex is informational only. In case of discrepancy, the Spanish text prevails.</w:t>
-      </w:r>
-    </w:p>
-    <w:p>
-      <w:r>
-        <w:pict>
-          <v:rect style="width:0;height:1.5pt" o:hralign="center" o:hrstd="t" o:hr="t"/>
-        </w:pict>
-      </w:r>
-    </w:p>
-    <w:p>
-      <w:pPr>
-        <w:pStyle w:val="FirstParagraph"/>
-      </w:pPr>
-      <w:r>
-        <w:t xml:space="preserve">Firmado en Madrid, a 12 de mayo de 2024.</w:t>
-      </w:r>
-    </w:p>
-    <w:p>
-      <w:pPr>
-        <w:pStyle w:val="BodyText"/>
-      </w:pPr>
+        <w:t xml:space="preserve">D. Alejandro Rivas Montero, Director General.</w:t>
+      </w:r>
+      <w:r>
+        <w:t xml:space="preserve"> </w:t>
+      </w:r>
       <w:r>
         <w:rPr>
           <w:b/>
           <w:bCs/>
         </w:rPr>
-        <w:t xml:space="preserve">Sr. Joaquín Vela Bermúdez</w:t>
+        <w:t xml:space="preserve">Trabajador/a:</w:t>
       </w:r>
       <w:r>
         <w:t xml:space="preserve"> </w:t>
       </w:r>
       <w:r>
-        <w:t xml:space="preserve">Gerente · Clínica Delos</w:t>
+        <w:t xml:space="preserve">[nombre completo del residente].</w:t>
+      </w:r>
+      <w:r>
+        <w:t xml:space="preserve"> </w:t>
+      </w:r>
+      <w:r>
+        <w:rPr>
+          <w:b/>
+          <w:bCs/>
+        </w:rPr>
+        <w:t xml:space="preserve">Categoría profesional:</w:t>
+      </w:r>
+      <w:r>
+        <w:t xml:space="preserve"> </w:t>
+      </w:r>
+      <w:r>
+        <w:t xml:space="preserve">Médico interno residente (Grupo II del convenio colectivo).</w:t>
+      </w:r>
+    </w:p>
+    <w:bookmarkEnd w:id="9"/>
+    <w:bookmarkStart w:id="10" w:name="cláusula-primera-objeto-del-contrato"/>
+    <w:p>
+      <w:pPr>
+        <w:pStyle w:val="Heading2"/>
+      </w:pPr>
+      <w:r>
+        <w:t xml:space="preserve">Cláusula primera — Objeto del contrato</w:t>
+      </w:r>
+    </w:p>
+    <w:p>
+      <w:pPr>
+        <w:pStyle w:val="FirstParagraph"/>
+      </w:pPr>
+      <w:r>
+        <w:t xml:space="preserve">El presente contrato tiene por objeto la prestación de servicios como médico interno residente en el servicio de [especialidad], dentro del programa de formación sanitaria especializada regulado por el Real Decreto 183/2008, de 8 de febrero.</w:t>
+      </w:r>
+    </w:p>
+    <w:p>
+      <w:pPr>
+        <w:pStyle w:val="BodyText"/>
+      </w:pPr>
+      <w:r>
+        <w:t xml:space="preserve">El residente prestará sus servicios bajo la supervisión del tutor designado por la comisión de docencia, desarrollando las competencias profesionales propias de su especialidad conforme al programa formativo vigente.</w:t>
+      </w:r>
+    </w:p>
+    <w:bookmarkEnd w:id="10"/>
+    <w:bookmarkStart w:id="11" w:name="cláusula-segunda-duración"/>
+    <w:p>
+      <w:pPr>
+        <w:pStyle w:val="Heading2"/>
+      </w:pPr>
+      <w:r>
+        <w:t xml:space="preserve">Cláusula segunda — Duración</w:t>
+      </w:r>
+    </w:p>
+    <w:p>
+      <w:pPr>
+        <w:pStyle w:val="FirstParagraph"/>
+      </w:pPr>
+      <w:r>
+        <w:t xml:space="preserve">El contrato se formaliza por una duración determinada vinculada al periodo formativo, con fecha de inicio el [fecha] y finalización prevista el [fecha], coincidente con la duración del programa de la especialidad.</w:t>
+      </w:r>
+    </w:p>
+    <w:p>
+      <w:pPr>
+        <w:pStyle w:val="BodyText"/>
+      </w:pPr>
+      <w:r>
+        <w:t xml:space="preserve">La renovación anual está condicionada a la evaluación positiva del residente por parte de la comisión de docencia y al mantenimiento de la acreditación del centro para la especialidad.</w:t>
+      </w:r>
+    </w:p>
+    <w:bookmarkEnd w:id="11"/>
+    <w:bookmarkStart w:id="12" w:name="cláusula-tercera-jornada-y-horario"/>
+    <w:p>
+      <w:pPr>
+        <w:pStyle w:val="Heading2"/>
+      </w:pPr>
+      <w:r>
+        <w:t xml:space="preserve">Cláusula tercera — Jornada y horario</w:t>
+      </w:r>
+    </w:p>
+    <w:p>
+      <w:pPr>
+        <w:pStyle w:val="FirstParagraph"/>
+      </w:pPr>
+      <w:r>
+        <w:t xml:space="preserve">La jornada ordinaria es de</w:t>
+      </w:r>
+      <w:r>
+        <w:t xml:space="preserve"> </w:t>
+      </w:r>
+      <w:r>
+        <w:rPr>
+          <w:b/>
+          <w:bCs/>
+        </w:rPr>
+        <w:t xml:space="preserve">35 horas semanales</w:t>
+      </w:r>
+      <w:r>
+        <w:t xml:space="preserve"> </w:t>
+      </w:r>
+      <w:r>
+        <w:t xml:space="preserve">en cómputo anual, conforme al convenio colectivo de aplicación. El residente participará en el sistema de guardias del servicio según el cuadrante aprobado por la dirección médica.</w:t>
+      </w:r>
+    </w:p>
+    <w:p>
+      <w:pPr>
+        <w:pStyle w:val="BodyText"/>
+      </w:pPr>
+      <w:r>
+        <w:t xml:space="preserve">Las guardias se retribuyen conforme a la tabla salarial vigente del convenio. El número máximo de guardias mensuales es de 5, pudiendo reducirse a 3 durante los periodos de rotación externa.</w:t>
+      </w:r>
+    </w:p>
+    <w:p>
+      <w:pPr>
+        <w:pStyle w:val="BodyText"/>
+      </w:pPr>
+      <w:r>
+        <w:t xml:space="preserve">El descanso mínimo post-guardia presencial es de 24 horas.</w:t>
+      </w:r>
+    </w:p>
+    <w:bookmarkEnd w:id="12"/>
+    <w:bookmarkStart w:id="13" w:name="cláusula-cuarta-retribución"/>
+    <w:p>
+      <w:pPr>
+        <w:pStyle w:val="Heading2"/>
+      </w:pPr>
+      <w:r>
+        <w:t xml:space="preserve">Cláusula cuarta — Retribución</w:t>
+      </w:r>
+    </w:p>
+    <w:p>
+      <w:pPr>
+        <w:pStyle w:val="FirstParagraph"/>
+      </w:pPr>
+      <w:r>
+        <w:t xml:space="preserve">El residente percibirá las retribuciones establecidas en la tabla salarial para su año de residencia:</w:t>
+      </w:r>
+    </w:p>
+    <w:p>
+      <w:pPr>
+        <w:pStyle w:val="Compact"/>
+        <w:numPr>
+          <w:ilvl w:val="0"/>
+          <w:numId w:val="1001"/>
+        </w:numPr>
+      </w:pPr>
+      <w:r>
+        <w:rPr>
+          <w:b/>
+          <w:bCs/>
+        </w:rPr>
+        <w:t xml:space="preserve">Salario base:</w:t>
+      </w:r>
+      <w:r>
+        <w:t xml:space="preserve"> </w:t>
+      </w:r>
+      <w:r>
+        <w:t xml:space="preserve">según grupo profesional II del convenio.</w:t>
+      </w:r>
+    </w:p>
+    <w:p>
+      <w:pPr>
+        <w:pStyle w:val="Compact"/>
+        <w:numPr>
+          <w:ilvl w:val="0"/>
+          <w:numId w:val="1001"/>
+        </w:numPr>
+      </w:pPr>
+      <w:r>
+        <w:rPr>
+          <w:b/>
+          <w:bCs/>
+        </w:rPr>
+        <w:t xml:space="preserve">Complemento de residencia:</w:t>
+      </w:r>
+      <w:r>
+        <w:t xml:space="preserve"> </w:t>
+      </w:r>
+      <w:r>
+        <w:t xml:space="preserve">conforme a la normativa aplicable.</w:t>
+      </w:r>
+    </w:p>
+    <w:p>
+      <w:pPr>
+        <w:pStyle w:val="Compact"/>
+        <w:numPr>
+          <w:ilvl w:val="0"/>
+          <w:numId w:val="1001"/>
+        </w:numPr>
+      </w:pPr>
+      <w:r>
+        <w:rPr>
+          <w:b/>
+          <w:bCs/>
+        </w:rPr>
+        <w:t xml:space="preserve">Complemento de guardias:</w:t>
+      </w:r>
+      <w:r>
+        <w:t xml:space="preserve"> </w:t>
+      </w:r>
+      <w:r>
+        <w:t xml:space="preserve">según módulo y tipo de guardia.</w:t>
+      </w:r>
+    </w:p>
+    <w:p>
+      <w:pPr>
+        <w:pStyle w:val="Compact"/>
+        <w:numPr>
+          <w:ilvl w:val="0"/>
+          <w:numId w:val="1001"/>
+        </w:numPr>
+      </w:pPr>
+      <w:r>
+        <w:rPr>
+          <w:b/>
+          <w:bCs/>
+        </w:rPr>
+        <w:t xml:space="preserve">Pagas extraordinarias:</w:t>
+      </w:r>
+      <w:r>
+        <w:t xml:space="preserve"> </w:t>
+      </w:r>
+      <w:r>
+        <w:t xml:space="preserve">dos al año, en junio y diciembre.</w:t>
+      </w:r>
+    </w:p>
+    <w:p>
+      <w:pPr>
+        <w:pStyle w:val="FirstParagraph"/>
+      </w:pPr>
+      <w:r>
+        <w:t xml:space="preserve">Las retribuciones se abonan por transferencia bancaria el último día hábil de cada mes.</w:t>
+      </w:r>
+    </w:p>
+    <w:bookmarkEnd w:id="13"/>
+    <w:bookmarkStart w:id="14" w:name="Xae2daf31c20b2a203e1c55a7042e190c4d539af"/>
+    <w:p>
+      <w:pPr>
+        <w:pStyle w:val="Heading2"/>
+      </w:pPr>
+      <w:r>
+        <w:t xml:space="preserve">Cláusula quinta — Obligaciones del residente</w:t>
+      </w:r>
+    </w:p>
+    <w:p>
+      <w:pPr>
+        <w:pStyle w:val="FirstParagraph"/>
+      </w:pPr>
+      <w:r>
+        <w:t xml:space="preserve">El residente se compromete a:</w:t>
+      </w:r>
+    </w:p>
+    <w:p>
+      <w:pPr>
+        <w:pStyle w:val="Compact"/>
+        <w:numPr>
+          <w:ilvl w:val="0"/>
+          <w:numId w:val="1002"/>
+        </w:numPr>
+      </w:pPr>
+      <w:r>
+        <w:t xml:space="preserve">Cumplir el programa formativo de su especialidad con dedicación plena.</w:t>
+      </w:r>
+    </w:p>
+    <w:p>
+      <w:pPr>
+        <w:pStyle w:val="Compact"/>
+        <w:numPr>
+          <w:ilvl w:val="0"/>
+          <w:numId w:val="1002"/>
+        </w:numPr>
+      </w:pPr>
+      <w:r>
+        <w:t xml:space="preserve">Asistir a las sesiones clínicas, seminarios y actividades formativas programadas.</w:t>
+      </w:r>
+    </w:p>
+    <w:p>
+      <w:pPr>
+        <w:pStyle w:val="Compact"/>
+        <w:numPr>
+          <w:ilvl w:val="0"/>
+          <w:numId w:val="1002"/>
+        </w:numPr>
+      </w:pPr>
+      <w:r>
+        <w:t xml:space="preserve">Mantener la confidencialidad de los datos de los pacientes conforme a la LOPD y el RGPD.</w:t>
+      </w:r>
+    </w:p>
+    <w:p>
+      <w:pPr>
+        <w:pStyle w:val="Compact"/>
+        <w:numPr>
+          <w:ilvl w:val="0"/>
+          <w:numId w:val="1002"/>
+        </w:numPr>
+      </w:pPr>
+      <w:r>
+        <w:t xml:space="preserve">Comunicar a la comisión de docencia cualquier incidencia que afecte a su formación.</w:t>
+      </w:r>
+    </w:p>
+    <w:p>
+      <w:pPr>
+        <w:pStyle w:val="Compact"/>
+        <w:numPr>
+          <w:ilvl w:val="0"/>
+          <w:numId w:val="1002"/>
+        </w:numPr>
+      </w:pPr>
+      <w:r>
+        <w:t xml:space="preserve">Participar en las actividades investigadoras del servicio cuando le sea requerido.</w:t>
+      </w:r>
+    </w:p>
+    <w:bookmarkEnd w:id="14"/>
+    <w:bookmarkStart w:id="15" w:name="X4ca9ec0565936912e40e3cf8484c36cf3add943"/>
+    <w:p>
+      <w:pPr>
+        <w:pStyle w:val="Heading2"/>
+      </w:pPr>
+      <w:r>
+        <w:t xml:space="preserve">Cláusula sexta — Obligaciones de la empresa</w:t>
+      </w:r>
+    </w:p>
+    <w:p>
+      <w:pPr>
+        <w:pStyle w:val="FirstParagraph"/>
+      </w:pPr>
+      <w:r>
+        <w:t xml:space="preserve">Clínica Delos se compromete a:</w:t>
+      </w:r>
+    </w:p>
+    <w:p>
+      <w:pPr>
+        <w:pStyle w:val="Compact"/>
+        <w:numPr>
+          <w:ilvl w:val="0"/>
+          <w:numId w:val="1003"/>
+        </w:numPr>
+      </w:pPr>
+      <w:r>
+        <w:t xml:space="preserve">Proporcionar la formación teórica y práctica prevista en el programa.</w:t>
+      </w:r>
+    </w:p>
+    <w:p>
+      <w:pPr>
+        <w:pStyle w:val="Compact"/>
+        <w:numPr>
+          <w:ilvl w:val="0"/>
+          <w:numId w:val="1003"/>
+        </w:numPr>
+      </w:pPr>
+      <w:r>
+        <w:t xml:space="preserve">Designar un tutor cualificado que supervise la actividad del residente.</w:t>
+      </w:r>
+    </w:p>
+    <w:p>
+      <w:pPr>
+        <w:pStyle w:val="Compact"/>
+        <w:numPr>
+          <w:ilvl w:val="0"/>
+          <w:numId w:val="1003"/>
+        </w:numPr>
+      </w:pPr>
+      <w:r>
+        <w:t xml:space="preserve">Facilitar el acceso a los recursos materiales necesarios para la formación.</w:t>
+      </w:r>
+    </w:p>
+    <w:p>
+      <w:pPr>
+        <w:pStyle w:val="Compact"/>
+        <w:numPr>
+          <w:ilvl w:val="0"/>
+          <w:numId w:val="1003"/>
+        </w:numPr>
+      </w:pPr>
+      <w:r>
+        <w:t xml:space="preserve">Realizar las evaluaciones formativas y anuales conforme al calendario establecido.</w:t>
+      </w:r>
+    </w:p>
+    <w:p>
+      <w:pPr>
+        <w:pStyle w:val="Compact"/>
+        <w:numPr>
+          <w:ilvl w:val="0"/>
+          <w:numId w:val="1003"/>
+        </w:numPr>
+      </w:pPr>
+      <w:r>
+        <w:t xml:space="preserve">Garantizar las condiciones de seguridad y salud laboral exigidas por la normativa.</w:t>
       </w:r>
     </w:p>
     <w:bookmarkEnd w:id="15"/>
+    <w:bookmarkStart w:id="16" w:name="cláusula-séptima-protección-de-datos"/>
+    <w:p>
+      <w:pPr>
+        <w:pStyle w:val="Heading2"/>
+      </w:pPr>
+      <w:r>
+        <w:t xml:space="preserve">Cláusula séptima — Protección de datos</w:t>
+      </w:r>
+    </w:p>
+    <w:p>
+      <w:pPr>
+        <w:pStyle w:val="FirstParagraph"/>
+      </w:pPr>
+      <w:r>
+        <w:t xml:space="preserve">Ambas partes se comprometen al cumplimiento del Reglamento (UE) 2016/679 (RGPD) y la Ley Orgánica 3/2018 de Protección de Datos Personales. Los datos del residente se tratarán exclusivamente para la gestión de la relación laboral y formativa, y se conservarán durante la vigencia del contrato y los plazos legales de prescripción.</w:t>
+      </w:r>
+    </w:p>
+    <w:p>
+      <w:r>
+        <w:pict>
+          <v:rect style="width:0;height:1.5pt" o:hralign="center" o:hrstd="t" o:hr="t"/>
+        </w:pict>
+      </w:r>
+    </w:p>
     <w:bookmarkEnd w:id="16"/>
+    <w:bookmarkEnd w:id="17"/>
+    <w:bookmarkStart w:id="25" w:name="X6644ccebbbe92b815e27e31b1344610fc4b7652"/>
+    <w:p>
+      <w:pPr>
+        <w:pStyle w:val="Heading1"/>
+      </w:pPr>
+      <w:r>
+        <w:t xml:space="preserve">Employment Contract — Medical Resident (English Summary)</w:t>
+      </w:r>
+    </w:p>
+    <w:p>
+      <w:pPr>
+        <w:pStyle w:val="FirstParagraph"/>
+      </w:pPr>
+      <w:r>
+        <w:t xml:space="preserve">This section provides an English-language summary of the key contractual terms for international residents.</w:t>
+      </w:r>
+    </w:p>
+    <w:bookmarkStart w:id="18" w:name="parties"/>
+    <w:p>
+      <w:pPr>
+        <w:pStyle w:val="Heading2"/>
+      </w:pPr>
+      <w:r>
+        <w:t xml:space="preserve">Parties</w:t>
+      </w:r>
+    </w:p>
+    <w:p>
+      <w:pPr>
+        <w:pStyle w:val="FirstParagraph"/>
+      </w:pPr>
+      <w:r>
+        <w:rPr>
+          <w:b/>
+          <w:bCs/>
+        </w:rPr>
+        <w:t xml:space="preserve">Employer:</w:t>
+      </w:r>
+      <w:r>
+        <w:t xml:space="preserve"> </w:t>
+      </w:r>
+      <w:r>
+        <w:t xml:space="preserve">Clínica Delos S.L., registered in Madrid, Spain.</w:t>
+      </w:r>
+      <w:r>
+        <w:t xml:space="preserve"> </w:t>
+      </w:r>
+      <w:r>
+        <w:rPr>
+          <w:b/>
+          <w:bCs/>
+        </w:rPr>
+        <w:t xml:space="preserve">Employee:</w:t>
+      </w:r>
+      <w:r>
+        <w:t xml:space="preserve"> </w:t>
+      </w:r>
+      <w:r>
+        <w:t xml:space="preserve">Medical resident assigned to the [specialty] department.</w:t>
+      </w:r>
+    </w:p>
+    <w:bookmarkEnd w:id="18"/>
+    <w:bookmarkStart w:id="19" w:name="position-and-purpose"/>
+    <w:p>
+      <w:pPr>
+        <w:pStyle w:val="Heading2"/>
+      </w:pPr>
+      <w:r>
+        <w:t xml:space="preserve">Position and Purpose</w:t>
+      </w:r>
+    </w:p>
+    <w:p>
+      <w:pPr>
+        <w:pStyle w:val="FirstParagraph"/>
+      </w:pPr>
+      <w:r>
+        <w:t xml:space="preserve">The resident is employed under a fixed-term training contract governed by Royal Decree 183/2008. The position involves supervised clinical training in the assigned specialty, under the guidance of an appointed tutor and the teaching committee.</w:t>
+      </w:r>
+    </w:p>
+    <w:bookmarkEnd w:id="19"/>
+    <w:bookmarkStart w:id="20" w:name="duration"/>
+    <w:p>
+      <w:pPr>
+        <w:pStyle w:val="Heading2"/>
+      </w:pPr>
+      <w:r>
+        <w:t xml:space="preserve">Duration</w:t>
+      </w:r>
+    </w:p>
+    <w:p>
+      <w:pPr>
+        <w:pStyle w:val="FirstParagraph"/>
+      </w:pPr>
+      <w:r>
+        <w:t xml:space="preserve">The contract duration matches the specialty training programme. Annual renewal is contingent upon a positive evaluation by the teaching committee and the centre’s continued accreditation.</w:t>
+      </w:r>
+    </w:p>
+    <w:bookmarkEnd w:id="20"/>
+    <w:bookmarkStart w:id="21" w:name="working-hours"/>
+    <w:p>
+      <w:pPr>
+        <w:pStyle w:val="Heading2"/>
+      </w:pPr>
+      <w:r>
+        <w:t xml:space="preserve">Working Hours</w:t>
+      </w:r>
+    </w:p>
+    <w:p>
+      <w:pPr>
+        <w:pStyle w:val="FirstParagraph"/>
+      </w:pPr>
+      <w:r>
+        <w:t xml:space="preserve">The standard working week is</w:t>
+      </w:r>
+      <w:r>
+        <w:t xml:space="preserve"> </w:t>
+      </w:r>
+      <w:r>
+        <w:rPr>
+          <w:b/>
+          <w:bCs/>
+        </w:rPr>
+        <w:t xml:space="preserve">35 hours</w:t>
+      </w:r>
+      <w:r>
+        <w:t xml:space="preserve"> </w:t>
+      </w:r>
+      <w:r>
+        <w:t xml:space="preserve">in annual computation, in accordance with the applicable collective bargaining agreement. The resident participates in the on-call rota, with a maximum of 5 on-call shifts per month. A minimum 24-hour rest period follows each on-call shift.</w:t>
+      </w:r>
+    </w:p>
+    <w:bookmarkEnd w:id="21"/>
+    <w:bookmarkStart w:id="22" w:name="compensation"/>
+    <w:p>
+      <w:pPr>
+        <w:pStyle w:val="Heading2"/>
+      </w:pPr>
+      <w:r>
+        <w:t xml:space="preserve">Compensation</w:t>
+      </w:r>
+    </w:p>
+    <w:p>
+      <w:pPr>
+        <w:pStyle w:val="FirstParagraph"/>
+      </w:pPr>
+      <w:r>
+        <w:t xml:space="preserve">Compensation includes base salary (Group II), a residency supplement, on-call supplements, and two annual bonus payments (June and December). Payment is made by bank transfer on the last business day of each month.</w:t>
+      </w:r>
+    </w:p>
+    <w:bookmarkEnd w:id="22"/>
+    <w:bookmarkStart w:id="23" w:name="obligations"/>
+    <w:p>
+      <w:pPr>
+        <w:pStyle w:val="Heading2"/>
+      </w:pPr>
+      <w:r>
+        <w:t xml:space="preserve">Obligations</w:t>
+      </w:r>
+    </w:p>
+    <w:p>
+      <w:pPr>
+        <w:pStyle w:val="FirstParagraph"/>
+      </w:pPr>
+      <w:r>
+        <w:t xml:space="preserve">The resident must: complete the training programme with full dedication, attend clinical sessions and seminars, maintain patient confidentiality under GDPR and Spanish data protection law, and report any training-related issues to the teaching committee.</w:t>
+      </w:r>
+    </w:p>
+    <w:p>
+      <w:pPr>
+        <w:pStyle w:val="BodyText"/>
+      </w:pPr>
+      <w:r>
+        <w:t xml:space="preserve">The employer must: provide theoretical and practical training, appoint a qualified tutor, supply necessary resources, conduct formative and annual evaluations, and ensure occupational health and safety compliance.</w:t>
+      </w:r>
+    </w:p>
+    <w:bookmarkEnd w:id="23"/>
+    <w:bookmarkStart w:id="24" w:name="data-protection"/>
+    <w:p>
+      <w:pPr>
+        <w:pStyle w:val="Heading2"/>
+      </w:pPr>
+      <w:r>
+        <w:t xml:space="preserve">Data Protection</w:t>
+      </w:r>
+    </w:p>
+    <w:p>
+      <w:pPr>
+        <w:pStyle w:val="FirstParagraph"/>
+      </w:pPr>
+      <w:r>
+        <w:t xml:space="preserve">Both parties comply with EU Regulation 2016/679 (GDPR) and Spanish Organic Law 3/2018. Personal data is processed solely for employment and training purposes and retained for the contract duration plus applicable statutory limitation periods.</w:t>
+      </w:r>
+    </w:p>
+    <w:p>
+      <w:r>
+        <w:pict>
+          <v:rect style="width:0;height:1.5pt" o:hralign="center" o:hrstd="t" o:hr="t"/>
+        </w:pict>
+      </w:r>
+    </w:p>
+    <w:p>
+      <w:pPr>
+        <w:pStyle w:val="FirstParagraph"/>
+      </w:pPr>
+      <w:r>
+        <w:t xml:space="preserve">Firmado: Dña. Marta Solís Echevarría · Directora de asesoría jurídica · Clínica Delos · 1 de septiembre de 2024.</w:t>
+      </w:r>
+    </w:p>
+    <w:bookmarkEnd w:id="24"/>
+    <w:bookmarkEnd w:id="25"/>
     <w:sectPr>
       <w:footnotePr>
         <w:numRestart w:val="eachSect"/>
@@ -355,8 +820,259 @@
       </w:pPr>
     </w:lvl>
   </w:abstractNum>
+  <w:abstractNum w:abstractNumId="991">
+    <w:nsid w:val="0000A991"/>
+    <w:multiLevelType w:val="multilevel"/>
+    <w:lvl w:ilvl="0">
+      <w:numFmt w:val="bullet"/>
+      <w:lvlText w:val=""/>
+      <w:lvlJc w:val="left"/>
+      <w:pPr>
+        <w:ind w:left="720" w:hanging="360"/>
+      </w:pPr>
+      <w:rPr>
+        <w:rFonts w:ascii="Symbol" w:hAnsi="Symbol" w:cs="Symbol" w:hint="default"/>
+      </w:rPr>
+    </w:lvl>
+    <w:lvl w:ilvl="1">
+      <w:numFmt w:val="bullet"/>
+      <w:lvlText w:val="o"/>
+      <w:lvlJc w:val="left"/>
+      <w:pPr>
+        <w:ind w:left="1440" w:hanging="360"/>
+      </w:pPr>
+      <w:rPr>
+        <w:rFonts w:ascii="Courier New" w:hAnsi="Courier New" w:cs="Courier New" w:hint="default"/>
+      </w:rPr>
+    </w:lvl>
+    <w:lvl w:ilvl="2">
+      <w:numFmt w:val="bullet"/>
+      <w:lvlText w:val=""/>
+      <w:lvlJc w:val="left"/>
+      <w:pPr>
+        <w:ind w:left="2160" w:hanging="360"/>
+      </w:pPr>
+      <w:rPr>
+        <w:rFonts w:ascii="Wingdings" w:hAnsi="Wingdings" w:cs="Wingdings" w:hint="default"/>
+      </w:rPr>
+    </w:lvl>
+    <w:lvl w:ilvl="3">
+      <w:numFmt w:val="bullet"/>
+      <w:lvlText w:val=""/>
+      <w:lvlJc w:val="left"/>
+      <w:pPr>
+        <w:ind w:left="2880" w:hanging="360"/>
+      </w:pPr>
+      <w:rPr>
+        <w:rFonts w:ascii="Symbol" w:hAnsi="Symbol" w:cs="Symbol" w:hint="default"/>
+      </w:rPr>
+    </w:lvl>
+    <w:lvl w:ilvl="4">
+      <w:numFmt w:val="bullet"/>
+      <w:lvlText w:val="o"/>
+      <w:lvlJc w:val="left"/>
+      <w:pPr>
+        <w:ind w:left="3600" w:hanging="360"/>
+      </w:pPr>
+      <w:rPr>
+        <w:rFonts w:ascii="Courier New" w:hAnsi="Courier New" w:cs="Courier New" w:hint="default"/>
+      </w:rPr>
+    </w:lvl>
+    <w:lvl w:ilvl="5">
+      <w:numFmt w:val="bullet"/>
+      <w:lvlText w:val=""/>
+      <w:lvlJc w:val="left"/>
+      <w:pPr>
+        <w:ind w:left="4320" w:hanging="360"/>
+      </w:pPr>
+      <w:rPr>
+        <w:rFonts w:ascii="Wingdings" w:hAnsi="Wingdings" w:cs="Wingdings" w:hint="default"/>
+      </w:rPr>
+    </w:lvl>
+    <w:lvl w:ilvl="6">
+      <w:numFmt w:val="bullet"/>
+      <w:lvlText w:val=""/>
+      <w:lvlJc w:val="left"/>
+      <w:pPr>
+        <w:ind w:left="5040" w:hanging="360"/>
+      </w:pPr>
+      <w:rPr>
+        <w:rFonts w:ascii="Symbol" w:hAnsi="Symbol" w:cs="Symbol" w:hint="default"/>
+      </w:rPr>
+    </w:lvl>
+    <w:lvl w:ilvl="7">
+      <w:numFmt w:val="bullet"/>
+      <w:lvlText w:val="o"/>
+      <w:lvlJc w:val="left"/>
+      <w:pPr>
+        <w:ind w:left="5760" w:hanging="360"/>
+      </w:pPr>
+      <w:rPr>
+        <w:rFonts w:ascii="Courier New" w:hAnsi="Courier New" w:cs="Courier New" w:hint="default"/>
+      </w:rPr>
+    </w:lvl>
+    <w:lvl w:ilvl="8">
+      <w:numFmt w:val="bullet"/>
+      <w:lvlText w:val=""/>
+      <w:lvlJc w:val="left"/>
+      <w:pPr>
+        <w:ind w:left="6480" w:hanging="360"/>
+      </w:pPr>
+      <w:rPr>
+        <w:rFonts w:ascii="Wingdings" w:hAnsi="Wingdings" w:cs="Wingdings" w:hint="default"/>
+      </w:rPr>
+    </w:lvl>
+  </w:abstractNum>
+  <w:abstractNum w:abstractNumId="99411">
+    <w:nsid w:val="00A99411"/>
+    <w:multiLevelType w:val="multilevel"/>
+    <w:lvl w:ilvl="0">
+      <w:start w:val="1"/>
+      <w:numFmt w:val="decimal"/>
+      <w:lvlText w:val="%1."/>
+      <w:lvlJc w:val="left"/>
+      <w:pPr>
+        <w:ind w:left="720" w:hanging="360"/>
+      </w:pPr>
+    </w:lvl>
+    <w:lvl w:ilvl="1">
+      <w:start w:val="1"/>
+      <w:numFmt w:val="decimal"/>
+      <w:lvlText w:val="%2."/>
+      <w:lvlJc w:val="left"/>
+      <w:pPr>
+        <w:ind w:left="1440" w:hanging="360"/>
+      </w:pPr>
+    </w:lvl>
+    <w:lvl w:ilvl="2">
+      <w:start w:val="1"/>
+      <w:numFmt w:val="decimal"/>
+      <w:lvlText w:val="%3."/>
+      <w:lvlJc w:val="left"/>
+      <w:pPr>
+        <w:ind w:left="2160" w:hanging="360"/>
+      </w:pPr>
+    </w:lvl>
+    <w:lvl w:ilvl="3">
+      <w:start w:val="1"/>
+      <w:numFmt w:val="decimal"/>
+      <w:lvlText w:val="%4."/>
+      <w:lvlJc w:val="left"/>
+      <w:pPr>
+        <w:ind w:left="2880" w:hanging="360"/>
+      </w:pPr>
+    </w:lvl>
+    <w:lvl w:ilvl="4">
+      <w:start w:val="1"/>
+      <w:numFmt w:val="decimal"/>
+      <w:lvlText w:val="%5."/>
+      <w:lvlJc w:val="left"/>
+      <w:pPr>
+        <w:ind w:left="3600" w:hanging="360"/>
+      </w:pPr>
+    </w:lvl>
+    <w:lvl w:ilvl="5">
+      <w:start w:val="1"/>
+      <w:numFmt w:val="decimal"/>
+      <w:lvlText w:val="%6."/>
+      <w:lvlJc w:val="left"/>
+      <w:pPr>
+        <w:ind w:left="4320" w:hanging="360"/>
+      </w:pPr>
+    </w:lvl>
+    <w:lvl w:ilvl="6">
+      <w:start w:val="1"/>
+      <w:numFmt w:val="decimal"/>
+      <w:lvlText w:val="%7."/>
+      <w:lvlJc w:val="left"/>
+      <w:pPr>
+        <w:ind w:left="5040" w:hanging="360"/>
+      </w:pPr>
+    </w:lvl>
+    <w:lvl w:ilvl="7">
+      <w:start w:val="1"/>
+      <w:numFmt w:val="decimal"/>
+      <w:lvlText w:val="%8."/>
+      <w:lvlJc w:val="left"/>
+      <w:pPr>
+        <w:ind w:left="5760" w:hanging="360"/>
+      </w:pPr>
+    </w:lvl>
+    <w:lvl w:ilvl="8">
+      <w:start w:val="1"/>
+      <w:numFmt w:val="decimal"/>
+      <w:lvlText w:val="%9."/>
+      <w:lvlJc w:val="left"/>
+      <w:pPr>
+        <w:ind w:left="6480" w:hanging="360"/>
+      </w:pPr>
+    </w:lvl>
+  </w:abstractNum>
   <w:num w:numId="1000">
     <w:abstractNumId w:val="990"/>
+  </w:num>
+  <w:num w:numId="1001">
+    <w:abstractNumId w:val="991"/>
+  </w:num>
+  <w:num w:numId="1002">
+    <w:abstractNumId w:val="99411"/>
+    <w:lvlOverride w:ilvl="0">
+      <w:startOverride w:val="1"/>
+    </w:lvlOverride>
+    <w:lvlOverride w:ilvl="1">
+      <w:startOverride w:val="1"/>
+    </w:lvlOverride>
+    <w:lvlOverride w:ilvl="2">
+      <w:startOverride w:val="1"/>
+    </w:lvlOverride>
+    <w:lvlOverride w:ilvl="3">
+      <w:startOverride w:val="1"/>
+    </w:lvlOverride>
+    <w:lvlOverride w:ilvl="4">
+      <w:startOverride w:val="1"/>
+    </w:lvlOverride>
+    <w:lvlOverride w:ilvl="5">
+      <w:startOverride w:val="1"/>
+    </w:lvlOverride>
+    <w:lvlOverride w:ilvl="6">
+      <w:startOverride w:val="1"/>
+    </w:lvlOverride>
+    <w:lvlOverride w:ilvl="7">
+      <w:startOverride w:val="1"/>
+    </w:lvlOverride>
+    <w:lvlOverride w:ilvl="8">
+      <w:startOverride w:val="1"/>
+    </w:lvlOverride>
+  </w:num>
+  <w:num w:numId="1003">
+    <w:abstractNumId w:val="99411"/>
+    <w:lvlOverride w:ilvl="0">
+      <w:startOverride w:val="1"/>
+    </w:lvlOverride>
+    <w:lvlOverride w:ilvl="1">
+      <w:startOverride w:val="1"/>
+    </w:lvlOverride>
+    <w:lvlOverride w:ilvl="2">
+      <w:startOverride w:val="1"/>
+    </w:lvlOverride>
+    <w:lvlOverride w:ilvl="3">
+      <w:startOverride w:val="1"/>
+    </w:lvlOverride>
+    <w:lvlOverride w:ilvl="4">
+      <w:startOverride w:val="1"/>
+    </w:lvlOverride>
+    <w:lvlOverride w:ilvl="5">
+      <w:startOverride w:val="1"/>
+    </w:lvlOverride>
+    <w:lvlOverride w:ilvl="6">
+      <w:startOverride w:val="1"/>
+    </w:lvlOverride>
+    <w:lvlOverride w:ilvl="7">
+      <w:startOverride w:val="1"/>
+    </w:lvlOverride>
+    <w:lvlOverride w:ilvl="8">
+      <w:startOverride w:val="1"/>
+    </w:lvlOverride>
   </w:num>
 </w:numbering>
 </file>

</xml_diff>